<commit_message>
take more notes about data schedule, backfills, etl vs elt
</commit_message>
<xml_diff>
--- a/lesson2/KESTRA.docx
+++ b/lesson2/KESTRA.docx
@@ -4985,13 +4985,6 @@
           <w:rFonts w:ascii="Montserrat" w:hAnsi="Montserrat"/>
         </w:rPr>
       </w:pPr>
-    </w:p>
-    <w:p>
-      <w:pPr>
-        <w:rPr>
-          <w:rFonts w:ascii="Montserrat" w:hAnsi="Montserrat"/>
-        </w:rPr>
-      </w:pPr>
       <w:r>
         <w:rPr>
           <w:rFonts w:ascii="Montserrat" w:hAnsi="Montserrat"/>
@@ -5005,18 +4998,588 @@
           <w:rFonts w:ascii="Montserrat" w:hAnsi="Montserrat"/>
         </w:rPr>
       </w:pPr>
-    </w:p>
-    <w:p>
-      <w:pPr>
-        <w:rPr>
-          <w:rFonts w:ascii="Montserrat" w:hAnsi="Montserrat"/>
-        </w:rPr>
-      </w:pPr>
+      <w:r>
+        <w:rPr>
+          <w:rFonts w:ascii="Montserrat" w:hAnsi="Montserrat"/>
+        </w:rPr>
+        <w:lastRenderedPageBreak/>
+        <w:t>Lập lịch bằng triggers và chạy bằng backfill:</w:t>
+      </w:r>
+    </w:p>
+    <w:p>
+      <w:pPr>
+        <w:rPr>
+          <w:rFonts w:ascii="Montserrat" w:hAnsi="Montserrat"/>
+        </w:rPr>
+      </w:pPr>
+      <w:r>
+        <w:rPr>
+          <w:rFonts w:ascii="Montserrat" w:hAnsi="Montserrat"/>
+        </w:rPr>
+        <w:t>Thêm thuộc tính concurrency limit = 1 để cho duy nhất 1 luồng được chạy vào 1 thời điểm</w:t>
+      </w:r>
+    </w:p>
+    <w:p>
+      <w:pPr>
+        <w:rPr>
+          <w:rFonts w:ascii="Montserrat" w:hAnsi="Montserrat"/>
+        </w:rPr>
+      </w:pPr>
+      <w:r>
+        <w:rPr>
+          <w:rFonts w:ascii="Montserrat" w:hAnsi="Montserrat"/>
+        </w:rPr>
+        <w:t>concurrency:</w:t>
+      </w:r>
+    </w:p>
+    <w:p>
+      <w:pPr>
+        <w:rPr>
+          <w:rFonts w:ascii="Montserrat" w:hAnsi="Montserrat"/>
+        </w:rPr>
+      </w:pPr>
+      <w:r>
+        <w:rPr>
+          <w:rFonts w:ascii="Montserrat" w:hAnsi="Montserrat"/>
+        </w:rPr>
+        <w:t xml:space="preserve">  limit: 1</w:t>
+      </w:r>
+    </w:p>
+    <w:p>
+      <w:pPr>
+        <w:rPr>
+          <w:rFonts w:ascii="Montserrat" w:hAnsi="Montserrat"/>
+        </w:rPr>
+      </w:pPr>
+      <w:r>
+        <w:rPr>
+          <w:rFonts w:ascii="Montserrat" w:hAnsi="Montserrat"/>
+        </w:rPr>
+        <w:t>triggers:</w:t>
+      </w:r>
+    </w:p>
+    <w:p>
+      <w:pPr>
+        <w:rPr>
+          <w:rFonts w:ascii="Montserrat" w:hAnsi="Montserrat"/>
+        </w:rPr>
+      </w:pPr>
+      <w:r>
+        <w:rPr>
+          <w:rFonts w:ascii="Montserrat" w:hAnsi="Montserrat"/>
+        </w:rPr>
+        <w:t xml:space="preserve">  - id: green_schedule</w:t>
+      </w:r>
+    </w:p>
+    <w:p>
+      <w:pPr>
+        <w:rPr>
+          <w:rFonts w:ascii="Montserrat" w:hAnsi="Montserrat"/>
+        </w:rPr>
+      </w:pPr>
+      <w:r>
+        <w:rPr>
+          <w:rFonts w:ascii="Montserrat" w:hAnsi="Montserrat"/>
+        </w:rPr>
+        <w:t xml:space="preserve">    type: io.kestra.plugin.core.trigger.Schedule</w:t>
+      </w:r>
+    </w:p>
+    <w:p>
+      <w:pPr>
+        <w:rPr>
+          <w:rFonts w:ascii="Montserrat" w:hAnsi="Montserrat"/>
+        </w:rPr>
+      </w:pPr>
+      <w:r>
+        <w:rPr>
+          <w:rFonts w:ascii="Montserrat" w:hAnsi="Montserrat"/>
+        </w:rPr>
+        <w:t xml:space="preserve">    cron: "0 9 1 * *"</w:t>
+      </w:r>
+    </w:p>
+    <w:p>
+      <w:pPr>
+        <w:rPr>
+          <w:rFonts w:ascii="Montserrat" w:hAnsi="Montserrat"/>
+        </w:rPr>
+      </w:pPr>
+      <w:r>
+        <w:rPr>
+          <w:rFonts w:ascii="Montserrat" w:hAnsi="Montserrat"/>
+        </w:rPr>
+        <w:t xml:space="preserve">    inputs:</w:t>
+      </w:r>
+    </w:p>
+    <w:p>
+      <w:pPr>
+        <w:rPr>
+          <w:rFonts w:ascii="Montserrat" w:hAnsi="Montserrat"/>
+        </w:rPr>
+      </w:pPr>
+      <w:r>
+        <w:rPr>
+          <w:rFonts w:ascii="Montserrat" w:hAnsi="Montserrat"/>
+        </w:rPr>
+        <w:t xml:space="preserve">      taxi: green</w:t>
+      </w:r>
+    </w:p>
+    <w:p>
+      <w:pPr>
+        <w:rPr>
+          <w:rFonts w:ascii="Montserrat" w:hAnsi="Montserrat"/>
+        </w:rPr>
+      </w:pPr>
+      <w:r>
+        <w:rPr>
+          <w:rFonts w:ascii="Montserrat" w:hAnsi="Montserrat"/>
+        </w:rPr>
+        <w:t>// Lưu ý: cron: “Minute Hour Date_in_month Month Date_in_week”</w:t>
+      </w:r>
+    </w:p>
+    <w:p>
+      <w:pPr>
+        <w:rPr>
+          <w:rFonts w:ascii="Montserrat" w:hAnsi="Montserrat"/>
+        </w:rPr>
+      </w:pPr>
+      <w:r>
+        <w:rPr>
+          <w:rFonts w:ascii="Montserrat" w:hAnsi="Montserrat"/>
+        </w:rPr>
+        <w:t xml:space="preserve">  - id: yellow_schedule</w:t>
+      </w:r>
+    </w:p>
+    <w:p>
+      <w:pPr>
+        <w:rPr>
+          <w:rFonts w:ascii="Montserrat" w:hAnsi="Montserrat"/>
+        </w:rPr>
+      </w:pPr>
+      <w:r>
+        <w:rPr>
+          <w:rFonts w:ascii="Montserrat" w:hAnsi="Montserrat"/>
+        </w:rPr>
+        <w:t xml:space="preserve">    type: io.kestra.plugin.core.trigger.Schedule</w:t>
+      </w:r>
+    </w:p>
+    <w:p>
+      <w:pPr>
+        <w:rPr>
+          <w:rFonts w:ascii="Montserrat" w:hAnsi="Montserrat"/>
+        </w:rPr>
+      </w:pPr>
+      <w:r>
+        <w:rPr>
+          <w:rFonts w:ascii="Montserrat" w:hAnsi="Montserrat"/>
+        </w:rPr>
+        <w:t xml:space="preserve">    cron: "0 10 1 * *"</w:t>
+      </w:r>
+    </w:p>
+    <w:p>
+      <w:pPr>
+        <w:rPr>
+          <w:rFonts w:ascii="Montserrat" w:hAnsi="Montserrat"/>
+        </w:rPr>
+      </w:pPr>
+      <w:r>
+        <w:rPr>
+          <w:rFonts w:ascii="Montserrat" w:hAnsi="Montserrat"/>
+        </w:rPr>
+        <w:t xml:space="preserve">    inputs:</w:t>
+      </w:r>
+    </w:p>
+    <w:p>
+      <w:pPr>
+        <w:rPr>
+          <w:rFonts w:ascii="Montserrat" w:hAnsi="Montserrat"/>
+        </w:rPr>
+      </w:pPr>
+      <w:r>
+        <w:rPr>
+          <w:rFonts w:ascii="Montserrat" w:hAnsi="Montserrat"/>
+        </w:rPr>
+        <w:t xml:space="preserve">      taxi: yellow</w:t>
+      </w:r>
+    </w:p>
+    <w:p>
+      <w:pPr>
+        <w:rPr>
+          <w:rFonts w:ascii="Montserrat" w:hAnsi="Montserrat"/>
+        </w:rPr>
+      </w:pPr>
+      <w:r>
+        <w:rPr>
+          <w:rFonts w:ascii="Montserrat" w:hAnsi="Montserrat"/>
+        </w:rPr>
+        <w:t>=&gt; tự động chạy task green_schedule vào lúc 9:00 am vào ngày 1 hàng tháng</w:t>
+      </w:r>
+    </w:p>
+    <w:p>
+      <w:pPr>
+        <w:rPr>
+          <w:rFonts w:ascii="Montserrat" w:hAnsi="Montserrat"/>
+        </w:rPr>
+      </w:pPr>
+      <w:r>
+        <w:rPr>
+          <w:rFonts w:ascii="Montserrat" w:hAnsi="Montserrat"/>
+        </w:rPr>
+        <w:t>=&gt;</w:t>
+      </w:r>
       <w:r>
         <w:rPr>
           <w:rFonts w:ascii="Montserrat" w:hAnsi="Montserrat"/>
         </w:rPr>
         <w:t xml:space="preserve"> </w:t>
+      </w:r>
+      <w:r>
+        <w:rPr>
+          <w:rFonts w:ascii="Montserrat" w:hAnsi="Montserrat"/>
+        </w:rPr>
+        <w:t xml:space="preserve">tự động chạy task </w:t>
+      </w:r>
+      <w:r>
+        <w:rPr>
+          <w:rFonts w:ascii="Montserrat" w:hAnsi="Montserrat"/>
+        </w:rPr>
+        <w:t>yellow</w:t>
+      </w:r>
+      <w:r>
+        <w:rPr>
+          <w:rFonts w:ascii="Montserrat" w:hAnsi="Montserrat"/>
+        </w:rPr>
+        <w:t xml:space="preserve">_schedule vào lúc </w:t>
+      </w:r>
+      <w:r>
+        <w:rPr>
+          <w:rFonts w:ascii="Montserrat" w:hAnsi="Montserrat"/>
+        </w:rPr>
+        <w:t>10</w:t>
+      </w:r>
+      <w:r>
+        <w:rPr>
+          <w:rFonts w:ascii="Montserrat" w:hAnsi="Montserrat"/>
+        </w:rPr>
+        <w:t>:00 am vào ngày 1 hàng tháng</w:t>
+      </w:r>
+    </w:p>
+    <w:p>
+      <w:pPr>
+        <w:rPr>
+          <w:rFonts w:ascii="Montserrat" w:hAnsi="Montserrat"/>
+        </w:rPr>
+      </w:pPr>
+      <w:r>
+        <w:rPr>
+          <w:rFonts w:ascii="Montserrat" w:hAnsi="Montserrat"/>
+        </w:rPr>
+        <w:t>Theo múi giờ quốc tế +0, nếu muốn chạy theo giờ VN thì phải -7 đi.</w:t>
+      </w:r>
+    </w:p>
+    <w:p>
+      <w:pPr>
+        <w:rPr>
+          <w:rFonts w:ascii="Montserrat" w:hAnsi="Montserrat"/>
+        </w:rPr>
+      </w:pPr>
+      <w:r>
+        <w:rPr>
+          <w:rFonts w:ascii="Montserrat" w:hAnsi="Montserrat"/>
+        </w:rPr>
+        <w:t>Do chạy tự động không thể gán biến manually cho các biến như month và year =&gt; sử dụng trigger.date để lấy giờ</w:t>
+      </w:r>
+      <w:r>
+        <w:rPr>
+          <w:rFonts w:ascii="Montserrat" w:hAnsi="Montserrat"/>
+        </w:rPr>
+        <w:t>, do vậy inputs chỉ còn mỗi taxi</w:t>
+      </w:r>
+    </w:p>
+    <w:p>
+      <w:pPr>
+        <w:rPr>
+          <w:rFonts w:ascii="Montserrat" w:hAnsi="Montserrat"/>
+        </w:rPr>
+      </w:pPr>
+      <w:r>
+        <w:rPr>
+          <w:rFonts w:ascii="Montserrat" w:hAnsi="Montserrat"/>
+        </w:rPr>
+        <w:t>=&gt; phải thay đổi biến variables:</w:t>
+      </w:r>
+    </w:p>
+    <w:p>
+      <w:pPr>
+        <w:rPr>
+          <w:rFonts w:ascii="Montserrat" w:hAnsi="Montserrat"/>
+        </w:rPr>
+      </w:pPr>
+      <w:r>
+        <w:rPr>
+          <w:rFonts w:ascii="Montserrat" w:hAnsi="Montserrat"/>
+        </w:rPr>
+        <w:t xml:space="preserve">  </w:t>
+      </w:r>
+      <w:r>
+        <w:rPr>
+          <w:rFonts w:ascii="Montserrat" w:hAnsi="Montserrat"/>
+          <w:highlight w:val="yellow"/>
+        </w:rPr>
+        <w:t>file: "{{inputs.taxi}}_tripdata_{{trigger.date | date('yyyy-MM')}}.csv"</w:t>
+      </w:r>
+    </w:p>
+    <w:p>
+      <w:pPr>
+        <w:rPr>
+          <w:rFonts w:ascii="Montserrat" w:hAnsi="Montserrat"/>
+        </w:rPr>
+      </w:pPr>
+      <w:r>
+        <w:rPr>
+          <w:rFonts w:ascii="Montserrat" w:hAnsi="Montserrat"/>
+        </w:rPr>
+        <w:t xml:space="preserve">  staging_table: "public.{{inputs.taxi}}_tripdata_staging"</w:t>
+      </w:r>
+    </w:p>
+    <w:p>
+      <w:pPr>
+        <w:rPr>
+          <w:rFonts w:ascii="Montserrat" w:hAnsi="Montserrat"/>
+        </w:rPr>
+      </w:pPr>
+      <w:r>
+        <w:rPr>
+          <w:rFonts w:ascii="Montserrat" w:hAnsi="Montserrat"/>
+        </w:rPr>
+        <w:t xml:space="preserve">  table: "public.{{inputs.taxi}}_tripdata"</w:t>
+      </w:r>
+    </w:p>
+    <w:p>
+      <w:pPr>
+        <w:rPr>
+          <w:rFonts w:ascii="Montserrat" w:hAnsi="Montserrat"/>
+        </w:rPr>
+      </w:pPr>
+      <w:r>
+        <w:rPr>
+          <w:rFonts w:ascii="Montserrat" w:hAnsi="Montserrat"/>
+        </w:rPr>
+        <w:lastRenderedPageBreak/>
+        <w:t xml:space="preserve">  </w:t>
+      </w:r>
+      <w:r>
+        <w:rPr>
+          <w:rFonts w:ascii="Montserrat" w:hAnsi="Montserrat"/>
+          <w:highlight w:val="yellow"/>
+        </w:rPr>
+        <w:t>data: "{{outputs.extract.outputFiles[inputs.taxi ~ '_tripdata_' ~ (trigger.date | date('yyyy-MM')) ~ '.csv']}}"</w:t>
+      </w:r>
+    </w:p>
+    <w:p>
+      <w:pPr>
+        <w:rPr>
+          <w:rFonts w:ascii="Montserrat" w:hAnsi="Montserrat"/>
+        </w:rPr>
+      </w:pPr>
+    </w:p>
+    <w:p>
+      <w:pPr>
+        <w:rPr>
+          <w:rFonts w:ascii="Montserrat" w:hAnsi="Montserrat"/>
+        </w:rPr>
+      </w:pPr>
+      <w:r>
+        <w:rPr>
+          <w:rFonts w:ascii="Montserrat" w:hAnsi="Montserrat"/>
+        </w:rPr>
+        <w:t>Backfills:</w:t>
+      </w:r>
+    </w:p>
+    <w:p>
+      <w:pPr>
+        <w:rPr>
+          <w:rFonts w:ascii="Montserrat" w:hAnsi="Montserrat"/>
+        </w:rPr>
+      </w:pPr>
+      <w:r>
+        <w:rPr>
+          <w:rFonts w:ascii="Montserrat" w:hAnsi="Montserrat"/>
+        </w:rPr>
+        <w:t>Chạy bù dữ liệu trong quá khứ (thời điểm do mình cấu hình qua UI)</w:t>
+      </w:r>
+    </w:p>
+    <w:p>
+      <w:pPr>
+        <w:rPr>
+          <w:rFonts w:ascii="Montserrat" w:hAnsi="Montserrat"/>
+        </w:rPr>
+      </w:pPr>
+      <w:r>
+        <w:rPr>
+          <w:rFonts w:ascii="Montserrat" w:hAnsi="Montserrat"/>
+        </w:rPr>
+        <w:br w:type="page"/>
+      </w:r>
+    </w:p>
+    <w:p>
+      <w:pPr>
+        <w:rPr>
+          <w:rFonts w:ascii="Montserrat" w:hAnsi="Montserrat"/>
+          <w:b/>
+          <w:bCs/>
+        </w:rPr>
+      </w:pPr>
+      <w:r>
+        <w:rPr>
+          <w:rFonts w:ascii="Montserrat" w:hAnsi="Montserrat"/>
+          <w:b/>
+          <w:bCs/>
+        </w:rPr>
+        <w:lastRenderedPageBreak/>
+        <w:t>2.4 ELT Pipelines in Kestra: Google Cloud Platform</w:t>
+      </w:r>
+    </w:p>
+    <w:p>
+      <w:pPr>
+        <w:rPr>
+          <w:rFonts w:ascii="Montserrat" w:hAnsi="Montserrat"/>
+        </w:rPr>
+      </w:pPr>
+      <w:r>
+        <w:rPr>
+          <w:rFonts w:ascii="Montserrat" w:hAnsi="Montserrat"/>
+        </w:rPr>
+        <w:t>Bài học trước sử dụng local DB (postgres) rồi, giờ sẽ chuyển sang dùng cloud, sẽ sử dụng:</w:t>
+      </w:r>
+    </w:p>
+    <w:p>
+      <w:pPr>
+        <w:rPr>
+          <w:rFonts w:ascii="Montserrat" w:hAnsi="Montserrat"/>
+        </w:rPr>
+      </w:pPr>
+      <w:r>
+        <w:rPr>
+          <w:rFonts w:ascii="Montserrat" w:hAnsi="Montserrat"/>
+        </w:rPr>
+        <w:t>1. google cloud storage (gcs): làm data lake</w:t>
+      </w:r>
+    </w:p>
+    <w:p>
+      <w:pPr>
+        <w:rPr>
+          <w:rFonts w:ascii="Montserrat" w:hAnsi="Montserrat"/>
+        </w:rPr>
+      </w:pPr>
+      <w:r>
+        <w:rPr>
+          <w:rFonts w:ascii="Montserrat" w:hAnsi="Montserrat"/>
+        </w:rPr>
+        <w:t xml:space="preserve">2. bigquery: làm datawarehouse </w:t>
+      </w:r>
+    </w:p>
+    <w:p>
+      <w:pPr>
+        <w:rPr>
+          <w:rFonts w:ascii="Montserrat" w:hAnsi="Montserrat"/>
+        </w:rPr>
+      </w:pPr>
+      <w:r>
+        <w:rPr>
+          <w:rFonts w:ascii="Montserrat" w:hAnsi="Montserrat"/>
+        </w:rPr>
+        <w:t>2.4.1: ETL vs ELT</w:t>
+      </w:r>
+    </w:p>
+    <w:p>
+      <w:pPr>
+        <w:rPr>
+          <w:rFonts w:ascii="Montserrat" w:hAnsi="Montserrat"/>
+        </w:rPr>
+      </w:pPr>
+      <w:r>
+        <w:rPr>
+          <w:rFonts w:ascii="Montserrat" w:hAnsi="Montserrat"/>
+        </w:rPr>
+        <w:t>ETL: Extract DL về, sau đó Transform sang Python, Load vào postgres DB.</w:t>
+      </w:r>
+    </w:p>
+    <w:p>
+      <w:pPr>
+        <w:rPr>
+          <w:rFonts w:ascii="Montserrat" w:hAnsi="Montserrat"/>
+        </w:rPr>
+      </w:pPr>
+      <w:r>
+        <w:rPr>
+          <w:rFonts w:ascii="Montserrat" w:hAnsi="Montserrat"/>
+        </w:rPr>
+        <w:t>Đây có thể được coi là tiêu chuẩn, nhưng để tận dụng sức mạnh của cloud, có thể thay đổi thứ tự, sau khi extract về có thể load luôn vào data lake rồi warehouse. Sử dụng ELT để làm việc với big query:</w:t>
+      </w:r>
+    </w:p>
+    <w:p>
+      <w:pPr>
+        <w:rPr>
+          <w:rFonts w:ascii="Montserrat" w:hAnsi="Montserrat"/>
+        </w:rPr>
+      </w:pPr>
+      <w:r>
+        <w:rPr>
+          <w:rFonts w:ascii="Montserrat" w:hAnsi="Montserrat"/>
+        </w:rPr>
+        <w:t>Extract: extract dataset from GitHub</w:t>
+      </w:r>
+    </w:p>
+    <w:p>
+      <w:pPr>
+        <w:rPr>
+          <w:rFonts w:ascii="Montserrat" w:hAnsi="Montserrat"/>
+        </w:rPr>
+      </w:pPr>
+      <w:r>
+        <w:rPr>
+          <w:rFonts w:ascii="Montserrat" w:hAnsi="Montserrat"/>
+        </w:rPr>
+        <w:t xml:space="preserve">Load: Load this dataset(csv, parquet file) into data lake(sử dụng gcs) </w:t>
+      </w:r>
+    </w:p>
+    <w:p>
+      <w:pPr>
+        <w:rPr>
+          <w:rFonts w:ascii="Montserrat" w:hAnsi="Montserrat"/>
+        </w:rPr>
+      </w:pPr>
+      <w:r>
+        <w:rPr>
+          <w:rFonts w:ascii="Montserrat" w:hAnsi="Montserrat"/>
+        </w:rPr>
+        <w:t>Transform: cuối cùng, tạo bảng ở trong data warehouse (bigquery) which sử dụng data trong data lakes để biểu diễn các sự biến đổi.</w:t>
+      </w:r>
+    </w:p>
+    <w:p>
+      <w:pPr>
+        <w:rPr>
+          <w:rFonts w:ascii="Montserrat" w:hAnsi="Montserrat"/>
+        </w:rPr>
+      </w:pPr>
+      <w:r>
+        <w:rPr>
+          <w:rFonts w:ascii="Montserrat" w:hAnsi="Montserrat"/>
+        </w:rPr>
+        <w:t>The reason for loading into the data warehouse before transforming means we can utilize the cloud's performance benefits for transforming large datasets. What might take a lot longer for a local machine, can take a fraction of the time in the cloud.</w:t>
+      </w:r>
+    </w:p>
+    <w:p>
+      <w:pPr>
+        <w:rPr>
+          <w:rFonts w:ascii="Montserrat" w:hAnsi="Montserrat"/>
+        </w:rPr>
+      </w:pPr>
+      <w:r>
+        <w:rPr>
+          <w:rFonts w:ascii="Montserrat" w:hAnsi="Montserrat"/>
+        </w:rPr>
+        <w:t>=&gt; Load dữ liệu vào trước đã, rồi sau đó tận dụng tốc độ của điện toán đám mây để chuyển đổi vì DL load 1 lần, nhưng có thể dùng để phân tích nhiều lần =&gt; giảm thời gian phân tích. (cơ chế là map dữ liệu từ datalake sang mà không cần phải lưu trữ)</w:t>
       </w:r>
     </w:p>
     <w:sectPr>

</xml_diff>